<commit_message>
Update Legal Judgement Retrieval.docx
</commit_message>
<xml_diff>
--- a/documentation/Legal Judgement Retrieval.docx
+++ b/documentation/Legal Judgement Retrieval.docx
@@ -54,62 +54,46 @@
     </w:p>
     <w:p>
       <w:pPr>
-        <w:ind w:left="720"/>
-        <w:rPr>
-          <w:b/>
-          <w:bCs/>
-        </w:rPr>
-      </w:pPr>
-      <w:r>
-        <w:t xml:space="preserve">In the legal profession, </w:t>
-      </w:r>
-      <w:r>
-        <w:t>lawyers and law students would need to find case laws containing the facts of the case, grounds of the case and Prayers(Reliefs) of the case related or similar to the current case in hand. The database is vast and finding them in the traditional manner takes a lot of time and might not find the best fit for the case.</w:t>
-      </w:r>
-    </w:p>
-    <w:p>
-      <w:pPr>
-        <w:ind w:left="720"/>
-        <w:rPr>
-          <w:b/>
-          <w:bCs/>
-        </w:rPr>
-      </w:pPr>
-      <w:r>
-        <w:t xml:space="preserve">This project leverages </w:t>
-      </w:r>
-      <w:r>
-        <w:rPr>
-          <w:b/>
-          <w:bCs/>
-        </w:rPr>
-        <w:t>Retrieval-Augmented Generation (RAG)</w:t>
-      </w:r>
-      <w:r>
-        <w:t xml:space="preserve"> and </w:t>
-      </w:r>
-      <w:r>
-        <w:rPr>
-          <w:b/>
-          <w:bCs/>
-        </w:rPr>
-        <w:t>semantic search</w:t>
-      </w:r>
-      <w:r>
-        <w:t xml:space="preserve"> to retrieve </w:t>
-      </w:r>
-      <w:r>
-        <w:rPr>
-          <w:b/>
-          <w:bCs/>
-        </w:rPr>
-        <w:t>and explain</w:t>
-      </w:r>
-      <w:r>
-        <w:t xml:space="preserve"> relevant judgments</w:t>
-      </w:r>
-      <w:r>
-        <w:t xml:space="preserve"> which captures deeper context and reasoning behind the judgements.</w:t>
+        <w:pStyle w:val="ListParagraph"/>
+      </w:pPr>
+      <w:r>
+        <w:t>In the legal profession, lawyers and law students would need to find case laws containing the facts of the case, grounds of the case and Prayers (Reliefs) of the case related or similar to the current case in hand. The database is vast and finding them in the traditional manner takes a lot of time and might not find the best fit for the case.</w:t>
+      </w:r>
+    </w:p>
+    <w:p>
+      <w:pPr>
+        <w:pStyle w:val="ListParagraph"/>
+      </w:pPr>
+      <w:r>
+        <w:t>For a common man (referred as litigant in judiciary) to explore legality of his case he needs to do a preliminary search about his belief and therefore he does research and in most of the cases he gets confused about the options available for his approach towards the case. This either discourages him to proceed further or consult a professional. Many times, the experienced advocates are busy and expensive. Thus, he may approach the junior advocates in the beginning and this drifts his case and the same makes him to lose the confidence in the judiciary exercise.</w:t>
+      </w:r>
+    </w:p>
+    <w:p>
+      <w:pPr>
+        <w:pStyle w:val="ListParagraph"/>
+      </w:pPr>
+      <w:r>
+        <w:t>This system tries to understand the problems by rewriting the feelings of the litigant and when the litigant question matches with the system understanding, it tries to search the similar facts existed in the cases decided by Supreme Court, High Courts of India and props up those case laws.</w:t>
+      </w:r>
+    </w:p>
+    <w:p>
+      <w:pPr>
+        <w:pStyle w:val="ListParagraph"/>
+      </w:pPr>
+      <w:r>
+        <w:t>The litigant needs to check whether the propped case is similar to him and then checks the grounds urged in the case and the prayers sought by the precedent. If that can simulate or encourage him to approach the Court for similar relief he can do so, or if his understanding of the case is not as per law, he can drop the case.</w:t>
+      </w:r>
+    </w:p>
+    <w:p>
+      <w:pPr>
+        <w:pStyle w:val="ListParagraph"/>
+        <w:rPr>
+          <w:b/>
+          <w:bCs/>
+        </w:rPr>
+      </w:pPr>
+      <w:r>
+        <w:t>This project leverages Retrieval-Augmented Generation (RAG) and semantic search to retrieve and explain relevant judgments which captures deeper context and reasoning behind the judgements.</w:t>
       </w:r>
     </w:p>
     <w:p>
@@ -240,6 +224,7 @@
           <w:b/>
           <w:bCs/>
         </w:rPr>
+        <w:lastRenderedPageBreak/>
         <w:t>What are you doing?(</w:t>
       </w:r>
       <w:r>
@@ -306,8 +291,21 @@
         </w:rPr>
       </w:pPr>
       <w:r>
-        <w:t>Parse PDF judgments using PyMuPDF / pdfplumber</w:t>
-      </w:r>
+        <w:t xml:space="preserve">Parse PDF judgments using </w:t>
+      </w:r>
+      <w:proofErr w:type="spellStart"/>
+      <w:r>
+        <w:t>PyMuPDF</w:t>
+      </w:r>
+      <w:proofErr w:type="spellEnd"/>
+      <w:r>
+        <w:t xml:space="preserve"> / </w:t>
+      </w:r>
+      <w:proofErr w:type="spellStart"/>
+      <w:r>
+        <w:t>pdfplumber</w:t>
+      </w:r>
+      <w:proofErr w:type="spellEnd"/>
     </w:p>
     <w:p>
       <w:pPr>
@@ -422,7 +420,23 @@
         </w:rPr>
       </w:pPr>
       <w:r>
-        <w:t>Encode case facts + laws using BAAI/bge-large-en or all-MiniLM-L6-v2</w:t>
+        <w:t>Encode case facts + laws using BAAI/</w:t>
+      </w:r>
+      <w:proofErr w:type="spellStart"/>
+      <w:r>
+        <w:t>bge</w:t>
+      </w:r>
+      <w:proofErr w:type="spellEnd"/>
+      <w:r>
+        <w:t>-large-</w:t>
+      </w:r>
+      <w:proofErr w:type="spellStart"/>
+      <w:r>
+        <w:t>en</w:t>
+      </w:r>
+      <w:proofErr w:type="spellEnd"/>
+      <w:r>
+        <w:t xml:space="preserve"> or all-MiniLM-L6-v2</w:t>
       </w:r>
     </w:p>
     <w:p>
@@ -438,8 +452,13 @@
         </w:rPr>
       </w:pPr>
       <w:r>
-        <w:t>Store embeddings in FAISS or ChromaDB</w:t>
-      </w:r>
+        <w:t xml:space="preserve">Store embeddings in FAISS or </w:t>
+      </w:r>
+      <w:proofErr w:type="spellStart"/>
+      <w:r>
+        <w:t>ChromaDB</w:t>
+      </w:r>
+      <w:proofErr w:type="spellEnd"/>
     </w:p>
     <w:p>
       <w:pPr>
@@ -466,7 +485,6 @@
         </w:numPr>
       </w:pPr>
       <w:r>
-        <w:lastRenderedPageBreak/>
         <w:t>Encode user query/new case facts</w:t>
       </w:r>
     </w:p>
@@ -674,7 +692,24 @@
           <w:b/>
           <w:bCs/>
         </w:rPr>
-        <w:t>Deployment (Vercel)</w:t>
+        <w:lastRenderedPageBreak/>
+        <w:t>Deployment (</w:t>
+      </w:r>
+      <w:proofErr w:type="spellStart"/>
+      <w:r>
+        <w:rPr>
+          <w:b/>
+          <w:bCs/>
+        </w:rPr>
+        <w:t>Vercel</w:t>
+      </w:r>
+      <w:proofErr w:type="spellEnd"/>
+      <w:r>
+        <w:rPr>
+          <w:b/>
+          <w:bCs/>
+        </w:rPr>
+        <w:t>)</w:t>
       </w:r>
     </w:p>
     <w:p>
@@ -685,8 +720,13 @@
         </w:numPr>
       </w:pPr>
       <w:r>
-        <w:t>Frontend (React) deployed directly to Vercel</w:t>
-      </w:r>
+        <w:t xml:space="preserve">Frontend (React) deployed directly to </w:t>
+      </w:r>
+      <w:proofErr w:type="spellStart"/>
+      <w:r>
+        <w:t>Vercel</w:t>
+      </w:r>
+      <w:proofErr w:type="spellEnd"/>
     </w:p>
     <w:p>
       <w:pPr>
@@ -696,7 +736,15 @@
         </w:numPr>
       </w:pPr>
       <w:r>
-        <w:t>Backend (FastAPI) hosted on a cloud platform (Railway, Render, or AWS Lambda)</w:t>
+        <w:t>Backend (</w:t>
+      </w:r>
+      <w:proofErr w:type="spellStart"/>
+      <w:r>
+        <w:t>FastAPI</w:t>
+      </w:r>
+      <w:proofErr w:type="spellEnd"/>
+      <w:r>
+        <w:t>) hosted on a cloud platform (Railway, Render, or AWS Lambda)</w:t>
       </w:r>
     </w:p>
     <w:p>
@@ -827,9 +875,19 @@
               <w:spacing w:after="160" w:line="278" w:lineRule="auto"/>
               <w:cnfStyle w:val="000000100000" w:firstRow="0" w:lastRow="0" w:firstColumn="0" w:lastColumn="0" w:oddVBand="0" w:evenVBand="0" w:oddHBand="1" w:evenHBand="0" w:firstRowFirstColumn="0" w:firstRowLastColumn="0" w:lastRowFirstColumn="0" w:lastRowLastColumn="0"/>
             </w:pPr>
+            <w:proofErr w:type="spellStart"/>
             <w:r>
-              <w:t>pdfplumber, PyMuPDF</w:t>
+              <w:t>pdfplumber</w:t>
             </w:r>
+            <w:proofErr w:type="spellEnd"/>
+            <w:r>
+              <w:t xml:space="preserve">, </w:t>
+            </w:r>
+            <w:proofErr w:type="spellStart"/>
+            <w:r>
+              <w:t>PyMuPDF</w:t>
+            </w:r>
+            <w:proofErr w:type="spellEnd"/>
           </w:p>
         </w:tc>
       </w:tr>
@@ -870,8 +928,13 @@
               <w:spacing w:after="160" w:line="278" w:lineRule="auto"/>
               <w:cnfStyle w:val="000000000000" w:firstRow="0" w:lastRow="0" w:firstColumn="0" w:lastColumn="0" w:oddVBand="0" w:evenVBand="0" w:oddHBand="0" w:evenHBand="0" w:firstRowFirstColumn="0" w:firstRowLastColumn="0" w:lastRowFirstColumn="0" w:lastRowLastColumn="0"/>
             </w:pPr>
+            <w:proofErr w:type="spellStart"/>
             <w:r>
-              <w:t>spaCy, regex</w:t>
+              <w:t>spaCy</w:t>
+            </w:r>
+            <w:proofErr w:type="spellEnd"/>
+            <w:r>
+              <w:t>, regex</w:t>
             </w:r>
           </w:p>
         </w:tc>
@@ -915,7 +978,23 @@
               <w:cnfStyle w:val="000000100000" w:firstRow="0" w:lastRow="0" w:firstColumn="0" w:lastColumn="0" w:oddVBand="0" w:evenVBand="0" w:oddHBand="1" w:evenHBand="0" w:firstRowFirstColumn="0" w:firstRowLastColumn="0" w:lastRowFirstColumn="0" w:lastRowLastColumn="0"/>
             </w:pPr>
             <w:r>
-              <w:t>sentence-transformers (BAAI/bge-large-en)</w:t>
+              <w:t>sentence-transformers (BAAI/</w:t>
+            </w:r>
+            <w:proofErr w:type="spellStart"/>
+            <w:r>
+              <w:t>bge</w:t>
+            </w:r>
+            <w:proofErr w:type="spellEnd"/>
+            <w:r>
+              <w:t>-large-</w:t>
+            </w:r>
+            <w:proofErr w:type="spellStart"/>
+            <w:r>
+              <w:t>en</w:t>
+            </w:r>
+            <w:proofErr w:type="spellEnd"/>
+            <w:r>
+              <w:t>)</w:t>
             </w:r>
           </w:p>
         </w:tc>
@@ -958,8 +1037,13 @@
               <w:cnfStyle w:val="000000000000" w:firstRow="0" w:lastRow="0" w:firstColumn="0" w:lastColumn="0" w:oddVBand="0" w:evenVBand="0" w:oddHBand="0" w:evenHBand="0" w:firstRowFirstColumn="0" w:firstRowLastColumn="0" w:lastRowFirstColumn="0" w:lastRowLastColumn="0"/>
             </w:pPr>
             <w:r>
-              <w:t>FAISS, ChromaDB</w:t>
+              <w:t xml:space="preserve">FAISS, </w:t>
             </w:r>
+            <w:proofErr w:type="spellStart"/>
+            <w:r>
+              <w:t>ChromaDB</w:t>
+            </w:r>
+            <w:proofErr w:type="spellEnd"/>
           </w:p>
         </w:tc>
       </w:tr>
@@ -987,7 +1071,6 @@
                 <w:b w:val="0"/>
                 <w:bCs w:val="0"/>
               </w:rPr>
-              <w:lastRenderedPageBreak/>
               <w:t>Retrieval &amp; RAG</w:t>
             </w:r>
           </w:p>
@@ -1002,9 +1085,19 @@
               <w:spacing w:after="160" w:line="278" w:lineRule="auto"/>
               <w:cnfStyle w:val="000000100000" w:firstRow="0" w:lastRow="0" w:firstColumn="0" w:lastColumn="0" w:oddVBand="0" w:evenVBand="0" w:oddHBand="1" w:evenHBand="0" w:firstRowFirstColumn="0" w:firstRowLastColumn="0" w:lastRowFirstColumn="0" w:lastRowLastColumn="0"/>
             </w:pPr>
+            <w:proofErr w:type="spellStart"/>
             <w:r>
-              <w:t>LangChain, LlamaIndex</w:t>
+              <w:t>LangChain</w:t>
             </w:r>
+            <w:proofErr w:type="spellEnd"/>
+            <w:r>
+              <w:t xml:space="preserve">, </w:t>
+            </w:r>
+            <w:proofErr w:type="spellStart"/>
+            <w:r>
+              <w:t>LlamaIndex</w:t>
+            </w:r>
+            <w:proofErr w:type="spellEnd"/>
           </w:p>
         </w:tc>
       </w:tr>
@@ -1089,9 +1182,11 @@
               <w:spacing w:after="160" w:line="278" w:lineRule="auto"/>
               <w:cnfStyle w:val="000000100000" w:firstRow="0" w:lastRow="0" w:firstColumn="0" w:lastColumn="0" w:oddVBand="0" w:evenVBand="0" w:oddHBand="1" w:evenHBand="0" w:firstRowFirstColumn="0" w:firstRowLastColumn="0" w:lastRowFirstColumn="0" w:lastRowLastColumn="0"/>
             </w:pPr>
+            <w:proofErr w:type="spellStart"/>
             <w:r>
               <w:t>FastAPI</w:t>
             </w:r>
+            <w:proofErr w:type="spellEnd"/>
           </w:p>
         </w:tc>
       </w:tr>
@@ -1176,8 +1271,13 @@
               <w:spacing w:after="160" w:line="278" w:lineRule="auto"/>
               <w:cnfStyle w:val="000000100000" w:firstRow="0" w:lastRow="0" w:firstColumn="0" w:lastColumn="0" w:oddVBand="0" w:evenVBand="0" w:oddHBand="1" w:evenHBand="0" w:firstRowFirstColumn="0" w:firstRowLastColumn="0" w:lastRowFirstColumn="0" w:lastRowLastColumn="0"/>
             </w:pPr>
+            <w:proofErr w:type="spellStart"/>
             <w:r>
-              <w:t>Vercel (frontend), Railway/Render/AWS (backend)</w:t>
+              <w:t>Vercel</w:t>
+            </w:r>
+            <w:proofErr w:type="spellEnd"/>
+            <w:r>
+              <w:t xml:space="preserve"> (frontend), Railway/Render/AWS (backend)</w:t>
             </w:r>
           </w:p>
         </w:tc>

</xml_diff>